<commit_message>
docs(sysdbg): state that the block is fully self-designed
The IP list entry naming axi_from_mem was the owner's early pick from the
V1.x memory-style port, not a requirement. D21, the review row and the
vendor manifest now say so instead of asking the teacher to confirm.
</commit_message>
<xml_diff>
--- a/doc/QNSC_SYSDBG_MAS.docx
+++ b/doc/QNSC_SYSDBG_MAS.docx
@@ -11111,13 +11111,7 @@
               <w:jc w:val="left"/>
             </w:pPr>
             <w:r>
-              <w:t xml:space="preserve">IP list:</w:t>
-            </w:r>
-            <w:r>
-              <w:t xml:space="preserve"> </w:t>
-            </w:r>
-            <w:r>
-              <w:t xml:space="preserve">“self-designed; only use</w:t>
+              <w:t xml:space="preserve">IP list names</w:t>
             </w:r>
             <w:r>
               <w:t xml:space="preserve"> </w:t>
@@ -11132,58 +11126,46 @@
               <w:t xml:space="preserve"> </w:t>
             </w:r>
             <w:r>
-              <w:t xml:space="preserve">from</w:t>
-            </w:r>
-            <w:r>
-              <w:t xml:space="preserve"> </w:t>
-            </w:r>
-            <w:r>
-              <w:rPr>
-                <w:rStyle w:val="VerbatimChar"/>
-              </w:rPr>
-              <w:t xml:space="preserve">pulp-platform/axi</w:t>
-            </w:r>
-            <w:r>
-              <w:t xml:space="preserve">”</w:t>
-            </w:r>
-          </w:p>
-        </w:tc>
-        <w:tc>
-          <w:tcPr/>
-          <w:p>
-            <w:pPr>
-              <w:pStyle w:val="Compact"/>
-              <w:jc w:val="left"/>
-            </w:pPr>
-            <w:r>
-              <w:t xml:space="preserve">Teacher, 2026-09-25</w:t>
-            </w:r>
-          </w:p>
-        </w:tc>
-        <w:tc>
-          <w:tcPr/>
-          <w:p>
-            <w:pPr>
-              <w:pStyle w:val="Compact"/>
-              <w:jc w:val="left"/>
-            </w:pPr>
-            <w:r>
-              <w:t xml:space="preserve">Not instantiated. The AXI manager of the teacher’s reference design (7.5) drives the channels directly, so no adapter is needed;</w:t>
-            </w:r>
-            <w:r>
-              <w:t xml:space="preserve"> </w:t>
-            </w:r>
-            <w:r>
-              <w:rPr>
-                <w:rStyle w:val="VerbatimChar"/>
-              </w:rPr>
-              <w:t xml:space="preserve">axi_from_mem</w:t>
-            </w:r>
-            <w:r>
-              <w:t xml:space="preserve"> </w:t>
-            </w:r>
-            <w:r>
-              <w:t xml:space="preserve">is the only IP the block may use, not one it must. To confirm with the teacher –</w:t>
+              <w:t xml:space="preserve">for the debugger</w:t>
+            </w:r>
+          </w:p>
+        </w:tc>
+        <w:tc>
+          <w:tcPr/>
+          <w:p>
+            <w:pPr>
+              <w:pStyle w:val="Compact"/>
+              <w:jc w:val="left"/>
+            </w:pPr>
+            <w:r>
+              <w:t xml:space="preserve">Owner, 2026-09-25</w:t>
+            </w:r>
+          </w:p>
+        </w:tc>
+        <w:tc>
+          <w:tcPr/>
+          <w:p>
+            <w:pPr>
+              <w:pStyle w:val="Compact"/>
+              <w:jc w:val="left"/>
+            </w:pPr>
+            <w:r>
+              <w:t xml:space="preserve">An early pick from the V1.x memory-style port. The block is self-designed, as the teacher asks: its own AXI4 manager (7.5) connects to</w:t>
+            </w:r>
+            <w:r>
+              <w:t xml:space="preserve"> </w:t>
+            </w:r>
+            <w:r>
+              <w:rPr>
+                <w:rStyle w:val="VerbatimChar"/>
+              </w:rPr>
+              <w:t xml:space="preserve">AXI_S0</w:t>
+            </w:r>
+            <w:r>
+              <w:t xml:space="preserve"> </w:t>
+            </w:r>
+            <w:r>
+              <w:t xml:space="preserve">directly, and no IP is instantiated –</w:t>
             </w:r>
             <w:r>
               <w:t xml:space="preserve"> </w:t>

</xml_diff>